<commit_message>
Complete MS #47.2 Control Tower hardening
</commit_message>
<xml_diff>
--- a/docs/milestones/MS-47/MS-47.docx
+++ b/docs/milestones/MS-47/MS-47.docx
@@ -140,7 +140,7 @@
               <w:rPr>
                 <w:rFonts w:ascii="Calibri" w:hAnsi="Calibri"/>
               </w:rPr>
-              <w:t>0.47.0</w:t>
+              <w:t>0.47.0, 0.47.1, 0.47.2</w:t>
             </w:r>
           </w:p>
         </w:tc>
@@ -185,7 +185,7 @@
               <w:rPr>
                 <w:rFonts w:ascii="Calibri" w:hAnsi="Calibri"/>
               </w:rPr>
-              <w:t>2026-08-31</w:t>
+              <w:t>2026-09-01</w:t>
             </w:r>
           </w:p>
         </w:tc>
@@ -280,7 +280,7 @@
         <w:pStyle w:val="ListBullet"/>
       </w:pPr>
       <w:r>
-        <w:t>A Material-influenced product shell using the investor-deck palette: warm-white work surfaces, a near-black operational plane, gold hierarchy, bronze boundaries, modern sans-serif typography, sentence case, rounded controls, and more space.</w:t>
+        <w:t>An approved warm editorial product shell using paper-white work surfaces, quiet stone rails, burnt-orange hierarchy, locally served IBM Plex typography, sentence case, rounded controls, and visible interaction states.</w:t>
       </w:r>
     </w:p>
     <w:p>
@@ -288,7 +288,7 @@
         <w:pStyle w:val="ListBullet"/>
       </w:pPr>
       <w:r>
-        <w:t>A graph-bound Company to Business problem to Workload to Technology scope to Operator lens path in which the first selections constrain available workloads, the workload changes the graph root, and scope and lens refine the resulting graph.</w:t>
+        <w:t>A graph-bound Company to Business problem to Workload to Technology scope to Operator lens path with session-stable estate context separated from active work controls.</w:t>
       </w:r>
     </w:p>
     <w:p>
@@ -304,7 +304,7 @@
         <w:pStyle w:val="ListBullet"/>
       </w:pPr>
       <w:r>
-        <w:t>A first-class graph operational source covering the canonical graph snapshot and its source-evidence pack.</w:t>
+        <w:t>A labelled claim band showing one snapshot identity plus explicit entity, relationship, rule, and validated-extension values.</w:t>
       </w:r>
     </w:p>
     <w:p>
@@ -312,7 +312,7 @@
         <w:pStyle w:val="ListBullet"/>
       </w:pPr>
       <w:r>
-        <w:t>Hash-chained graph projection change events on the existing replayable Server-Sent Events plane plus a five-second freshness refresh between events.</w:t>
+        <w:t>A 70-node readability guard with package-collapse, rules-and-proof, legacy-to-modern, and explicit full-render choices, plus pill-backed graph labels.</w:t>
       </w:r>
     </w:p>
     <w:p>
@@ -320,7 +320,7 @@
         <w:pStyle w:val="ListBullet"/>
       </w:pPr>
       <w:r>
-        <w:t>Live graph reload that refreshes metadata, perspectives, operator context, legend, metrics, and the active graph view.</w:t>
+        <w:t>A proof-oriented workload action that opens the existing governed proof-run evidence from the inspector.</w:t>
       </w:r>
     </w:p>
     <w:p>
@@ -328,7 +328,7 @@
         <w:pStyle w:val="ListBullet"/>
       </w:pPr>
       <w:r>
-        <w:t>Fail-closed invalidation of the source-evidence pack, Runtime projection, or Audit projection when its graph identity no longer matches the canonical graph.</w:t>
+        <w:t>A first-class graph operational source with hash-chained change events, five-second freshness refresh, and fail-closed downstream identity validation.</w:t>
       </w:r>
     </w:p>
     <w:p>
@@ -336,7 +336,23 @@
         <w:pStyle w:val="ListBullet"/>
       </w:pPr>
       <w:r>
-        <w:t>A critical alert for graph-binding invalidation and regression coverage across policy, HTTP, UI, identity, freshness, and documentation contracts.</w:t>
+        <w:t>Default refusal of non-loopback binds, an explicit exposure override, and a generated per-session bearer token required for verifier-audience HTTP routes.</w:t>
+      </w:r>
+    </w:p>
+    <w:p>
+      <w:pPr>
+        <w:pStyle w:val="ListBullet"/>
+      </w:pPr>
+      <w:r>
+        <w:t>Locally served SIL-OFL IBM Plex webfonts with no Google Fonts or other runtime asset request.</w:t>
+      </w:r>
+    </w:p>
+    <w:p>
+      <w:pPr>
+        <w:pStyle w:val="ListBullet"/>
+      </w:pPr>
+      <w:r>
+        <w:t>Regression coverage across policy, HTTP authorization, UI contracts, graph binding, freshness, and documentation.</w:t>
       </w:r>
     </w:p>
     <w:p>
@@ -349,7 +365,7 @@
     </w:p>
     <w:p>
       <w:r>
-        <w:t>MS #17 introduced the live read-only evidence plane, MS #46 added unified-estate navigation and trace, and MS #47 makes the canonical graph itself observable while bringing the interface to the LIGHTYEAR investor visual standard.</w:t>
+        <w:t>MS #17 introduced the live read-only evidence plane, MS #46 added unified-estate navigation and trace, and MS #47 makes the canonical graph itself observable. MS #47.1 and #47.2 close the independent visual, usability, density, and local-transport review without weakening the evidence boundary.</w:t>
       </w:r>
     </w:p>
     <w:p>
@@ -414,7 +430,15 @@
         <w:pStyle w:val="ListBullet"/>
       </w:pPr>
       <w:r>
-        <w:t>The local reference remains loopback-only and does not provide enterprise SSO, RBAC, managed streaming, or production hosting.</w:t>
+        <w:t>Implementer routes remain unauthenticated and are safe only on loopback; the explicit non-loopback override does not make a deployment secure.</w:t>
+      </w:r>
+    </w:p>
+    <w:p>
+      <w:pPr>
+        <w:pStyle w:val="ListBullet"/>
+      </w:pPr>
+      <w:r>
+        <w:t>The verifier token is per-session audience authorization, not enterprise identity, RBAC, or a substitute for customer SSO/OIDC at a reverse proxy.</w:t>
       </w:r>
     </w:p>
     <w:p>
@@ -454,7 +478,7 @@
         <w:pStyle w:val="ListBullet"/>
       </w:pPr>
       <w:r>
-        <w:t>CHANGELOG.md release section(s): 0.47.0</w:t>
+        <w:t>CHANGELOG.md release section(s): 0.47.0, 0.47.1, 0.47.2</w:t>
       </w:r>
     </w:p>
     <w:p>

</xml_diff>

<commit_message>
MS #47.2: harden and modernize the Evidence Control Tower (#54)
Complete the responsive Control Tower redesign, density guard, verifier token boundary, safe bind posture, self-hosted fonts, and refreshed content-addressed evidence chain.
</commit_message>
<xml_diff>
--- a/docs/milestones/MS-47/MS-47.docx
+++ b/docs/milestones/MS-47/MS-47.docx
@@ -140,7 +140,7 @@
               <w:rPr>
                 <w:rFonts w:ascii="Calibri" w:hAnsi="Calibri"/>
               </w:rPr>
-              <w:t>0.47.0</w:t>
+              <w:t>0.47.0, 0.47.1, 0.47.2</w:t>
             </w:r>
           </w:p>
         </w:tc>
@@ -185,7 +185,7 @@
               <w:rPr>
                 <w:rFonts w:ascii="Calibri" w:hAnsi="Calibri"/>
               </w:rPr>
-              <w:t>2026-08-31</w:t>
+              <w:t>2026-09-01</w:t>
             </w:r>
           </w:p>
         </w:tc>
@@ -280,7 +280,7 @@
         <w:pStyle w:val="ListBullet"/>
       </w:pPr>
       <w:r>
-        <w:t>A Material-influenced product shell using the investor-deck palette: warm-white work surfaces, a near-black operational plane, gold hierarchy, bronze boundaries, modern sans-serif typography, sentence case, rounded controls, and more space.</w:t>
+        <w:t>An approved warm editorial product shell using paper-white work surfaces, quiet stone rails, burnt-orange hierarchy, locally served IBM Plex typography, sentence case, rounded controls, and visible interaction states.</w:t>
       </w:r>
     </w:p>
     <w:p>
@@ -288,7 +288,7 @@
         <w:pStyle w:val="ListBullet"/>
       </w:pPr>
       <w:r>
-        <w:t>A graph-bound Company to Business problem to Workload to Technology scope to Operator lens path in which the first selections constrain available workloads, the workload changes the graph root, and scope and lens refine the resulting graph.</w:t>
+        <w:t>A graph-bound Company to Business problem to Workload to Technology scope to Operator lens path with session-stable estate context separated from active work controls.</w:t>
       </w:r>
     </w:p>
     <w:p>
@@ -304,7 +304,7 @@
         <w:pStyle w:val="ListBullet"/>
       </w:pPr>
       <w:r>
-        <w:t>A first-class graph operational source covering the canonical graph snapshot and its source-evidence pack.</w:t>
+        <w:t>A labelled claim band showing one snapshot identity plus explicit entity, relationship, rule, and validated-extension values.</w:t>
       </w:r>
     </w:p>
     <w:p>
@@ -312,7 +312,7 @@
         <w:pStyle w:val="ListBullet"/>
       </w:pPr>
       <w:r>
-        <w:t>Hash-chained graph projection change events on the existing replayable Server-Sent Events plane plus a five-second freshness refresh between events.</w:t>
+        <w:t>A 70-node readability guard with package-collapse, rules-and-proof, legacy-to-modern, and explicit full-render choices, plus pill-backed graph labels.</w:t>
       </w:r>
     </w:p>
     <w:p>
@@ -320,7 +320,7 @@
         <w:pStyle w:val="ListBullet"/>
       </w:pPr>
       <w:r>
-        <w:t>Live graph reload that refreshes metadata, perspectives, operator context, legend, metrics, and the active graph view.</w:t>
+        <w:t>A proof-oriented workload action that opens the existing governed proof-run evidence from the inspector.</w:t>
       </w:r>
     </w:p>
     <w:p>
@@ -328,7 +328,7 @@
         <w:pStyle w:val="ListBullet"/>
       </w:pPr>
       <w:r>
-        <w:t>Fail-closed invalidation of the source-evidence pack, Runtime projection, or Audit projection when its graph identity no longer matches the canonical graph.</w:t>
+        <w:t>A first-class graph operational source with hash-chained change events, five-second freshness refresh, and fail-closed downstream identity validation.</w:t>
       </w:r>
     </w:p>
     <w:p>
@@ -336,7 +336,23 @@
         <w:pStyle w:val="ListBullet"/>
       </w:pPr>
       <w:r>
-        <w:t>A critical alert for graph-binding invalidation and regression coverage across policy, HTTP, UI, identity, freshness, and documentation contracts.</w:t>
+        <w:t>Default refusal of non-loopback binds, an explicit exposure override, and a generated per-session bearer token required for verifier-audience HTTP routes.</w:t>
+      </w:r>
+    </w:p>
+    <w:p>
+      <w:pPr>
+        <w:pStyle w:val="ListBullet"/>
+      </w:pPr>
+      <w:r>
+        <w:t>Locally served SIL-OFL IBM Plex webfonts with no Google Fonts or other runtime asset request.</w:t>
+      </w:r>
+    </w:p>
+    <w:p>
+      <w:pPr>
+        <w:pStyle w:val="ListBullet"/>
+      </w:pPr>
+      <w:r>
+        <w:t>Regression coverage across policy, HTTP authorization, UI contracts, graph binding, freshness, and documentation.</w:t>
       </w:r>
     </w:p>
     <w:p>
@@ -349,7 +365,7 @@
     </w:p>
     <w:p>
       <w:r>
-        <w:t>MS #17 introduced the live read-only evidence plane, MS #46 added unified-estate navigation and trace, and MS #47 makes the canonical graph itself observable while bringing the interface to the LIGHTYEAR investor visual standard.</w:t>
+        <w:t>MS #17 introduced the live read-only evidence plane, MS #46 added unified-estate navigation and trace, and MS #47 makes the canonical graph itself observable. MS #47.1 and #47.2 close the independent visual, usability, density, and local-transport review without weakening the evidence boundary.</w:t>
       </w:r>
     </w:p>
     <w:p>
@@ -414,7 +430,15 @@
         <w:pStyle w:val="ListBullet"/>
       </w:pPr>
       <w:r>
-        <w:t>The local reference remains loopback-only and does not provide enterprise SSO, RBAC, managed streaming, or production hosting.</w:t>
+        <w:t>Implementer routes remain unauthenticated and are safe only on loopback; the explicit non-loopback override does not make a deployment secure.</w:t>
+      </w:r>
+    </w:p>
+    <w:p>
+      <w:pPr>
+        <w:pStyle w:val="ListBullet"/>
+      </w:pPr>
+      <w:r>
+        <w:t>The verifier token is per-session audience authorization, not enterprise identity, RBAC, or a substitute for customer SSO/OIDC at a reverse proxy.</w:t>
       </w:r>
     </w:p>
     <w:p>
@@ -454,7 +478,7 @@
         <w:pStyle w:val="ListBullet"/>
       </w:pPr>
       <w:r>
-        <w:t>CHANGELOG.md release section(s): 0.47.0</w:t>
+        <w:t>CHANGELOG.md release section(s): 0.47.0, 0.47.1, 0.47.2</w:t>
       </w:r>
     </w:p>
     <w:p>

</xml_diff>

<commit_message>
MS #47.3: finish Control Tower craft and accessibility
</commit_message>
<xml_diff>
--- a/docs/milestones/MS-47/MS-47.docx
+++ b/docs/milestones/MS-47/MS-47.docx
@@ -140,7 +140,7 @@
               <w:rPr>
                 <w:rFonts w:ascii="Calibri" w:hAnsi="Calibri"/>
               </w:rPr>
-              <w:t>0.47.0, 0.47.1, 0.47.2</w:t>
+              <w:t>0.47.0, 0.47.1, 0.47.2, 0.47.3</w:t>
             </w:r>
           </w:p>
         </w:tc>
@@ -312,7 +312,31 @@
         <w:pStyle w:val="ListBullet"/>
       </w:pPr>
       <w:r>
-        <w:t>A 70-node readability guard with package-collapse, rules-and-proof, legacy-to-modern, and explicit full-render choices, plus pill-backed graph labels.</w:t>
+        <w:t>A 70-node readability guard whose reduction and full-render actions dismiss correctly, with package-collapse, rules-and-proof, and legacy-to-modern choices.</w:t>
+      </w:r>
+    </w:p>
+    <w:p>
+      <w:pPr>
+        <w:pStyle w:val="ListBullet"/>
+      </w:pPr>
+      <w:r>
+        <w:t>Collision-aware graph labels across five candidate positions, with tooltip preservation and suppression only when no readable placement exists.</w:t>
+      </w:r>
+    </w:p>
+    <w:p>
+      <w:pPr>
+        <w:pStyle w:val="ListBullet"/>
+      </w:pPr>
+      <w:r>
+        <w:t>Keyboard-operable graph nodes with roving focus, spatial arrow-key navigation, Enter/Space inspection, Home-to-root behavior, descriptive names, and visible focus.</w:t>
+      </w:r>
+    </w:p>
+    <w:p>
+      <w:pPr>
+        <w:pStyle w:val="ListBullet"/>
+      </w:pPr>
+      <w:r>
+        <w:t>Readable top-control and repeated metadata labels plus a non-clipping accessible live connection status.</w:t>
       </w:r>
     </w:p>
     <w:p>
@@ -352,7 +376,7 @@
         <w:pStyle w:val="ListBullet"/>
       </w:pPr>
       <w:r>
-        <w:t>Regression coverage across policy, HTTP authorization, UI contracts, graph binding, freshness, and documentation.</w:t>
+        <w:t>Regression coverage across policy, HTTP authorization, UI contracts, graph binding, density behavior, label placement, freshness, and documentation.</w:t>
       </w:r>
     </w:p>
     <w:p>
@@ -365,7 +389,7 @@
     </w:p>
     <w:p>
       <w:r>
-        <w:t>MS #17 introduced the live read-only evidence plane, MS #46 added unified-estate navigation and trace, and MS #47 makes the canonical graph itself observable. MS #47.1 and #47.2 close the independent visual, usability, density, and local-transport review without weakening the evidence boundary.</w:t>
+        <w:t>MS #17 introduced the live read-only evidence plane, MS #46 added unified-estate navigation and trace, and MS #47 makes the canonical graph itself observable. MS #47.1 through #47.3 close the independent visual, usability, density, local-transport, craft, and accessibility reviews without weakening the evidence boundary.</w:t>
       </w:r>
     </w:p>
     <w:p>
@@ -478,7 +502,7 @@
         <w:pStyle w:val="ListBullet"/>
       </w:pPr>
       <w:r>
-        <w:t>CHANGELOG.md release section(s): 0.47.0, 0.47.1, 0.47.2</w:t>
+        <w:t>CHANGELOG.md release section(s): 0.47.0, 0.47.1, 0.47.2, 0.47.3</w:t>
       </w:r>
     </w:p>
     <w:p>

</xml_diff>